<commit_message>
Update NotebookLM Interview Prep Guide
Replace The Fatigue-Resistant NotebookLM Interview Prep Guide (.docx) with an updated version. This is a binary-document update containing content and/or formatting changes; diffs are not viewable in plain text.
</commit_message>
<xml_diff>
--- a/The Fatigue-Resistant NotebookLM Interview Prep Guide.docx
+++ b/The Fatigue-Resistant NotebookLM Interview Prep Guide.docx
@@ -5,6 +5,15 @@
     <w:p/>
     <w:sdt>
       <w:sdtPr>
+        <w:rPr>
+          <w:rFonts w:asciiTheme="minorHAnsi" w:eastAsiaTheme="minorHAnsi" w:hAnsiTheme="minorHAnsi" w:cstheme="minorBidi"/>
+          <w:color w:val="auto"/>
+          <w:kern w:val="2"/>
+          <w:sz w:val="22"/>
+          <w:szCs w:val="22"/>
+          <w:lang w:val="en-GB"/>
+          <w14:ligatures w14:val="standardContextual"/>
+        </w:rPr>
         <w:id w:val="-1814634532"/>
         <w:docPartObj>
           <w:docPartGallery w:val="Table of Contents"/>
@@ -13,16 +22,9 @@
       </w:sdtPr>
       <w:sdtEndPr>
         <w:rPr>
-          <w:rFonts w:asciiTheme="minorHAnsi" w:eastAsiaTheme="minorHAnsi" w:hAnsiTheme="minorHAnsi" w:cstheme="minorBidi"/>
           <w:b/>
           <w:bCs/>
           <w:noProof/>
-          <w:color w:val="auto"/>
-          <w:kern w:val="2"/>
-          <w:sz w:val="22"/>
-          <w:szCs w:val="22"/>
-          <w:lang w:val="en-GB"/>
-          <w14:ligatures w14:val="standardContextual"/>
         </w:rPr>
       </w:sdtEndPr>
       <w:sdtContent>
@@ -1101,11 +1103,13 @@
     </w:p>
     <w:p>
       <w:pPr>
+        <w:pStyle w:val="NoSpacing"/>
         <w:ind w:left="720"/>
         <w:rPr>
           <w:rFonts w:ascii="Courier New" w:hAnsi="Courier New" w:cs="Courier New"/>
         </w:rPr>
       </w:pPr>
+      <w:bookmarkStart w:id="5" w:name="_Toc233657359"/>
       <w:r>
         <w:rPr>
           <w:rFonts w:ascii="Courier New" w:hAnsi="Courier New" w:cs="Courier New"/>
@@ -1115,6 +1119,7 @@
     </w:p>
     <w:p>
       <w:pPr>
+        <w:pStyle w:val="NoSpacing"/>
         <w:ind w:left="720"/>
         <w:rPr>
           <w:rFonts w:ascii="Courier New" w:hAnsi="Courier New" w:cs="Courier New"/>
@@ -1124,23 +1129,33 @@
         <w:rPr>
           <w:rFonts w:ascii="Courier New" w:hAnsi="Courier New" w:cs="Courier New"/>
         </w:rPr>
-        <w:t xml:space="preserve">You are a grounded, direct Executive Interview Coach. Adopt "The Fatigue Firewall" protocol. Assume the candidate is a seasoned, highly experienced professional who is mentally exhausted from the current job market. Your goal is to build </w:t>
+        <w:t xml:space="preserve">You are a grounded, direct Executive Interview Coach. Adopt "The Fatigue Firewall" protocol. Assume the candidate is a seasoned, highly experienced cybersecurity professional who is mentally exhausted from a long job search. Your dual goals are: (1) generate clear, practical interview preparation </w:t>
       </w:r>
       <w:r>
         <w:rPr>
           <w:rFonts w:ascii="Courier New" w:hAnsi="Courier New" w:cs="Courier New"/>
         </w:rPr>
         <w:lastRenderedPageBreak/>
-        <w:t>genuine, quiet confidence by focusing strictly on hard, evidence-based matches.</w:t>
-      </w:r>
-    </w:p>
-    <w:p>
-      <w:pPr>
+        <w:t>content, and (2) rebuild genuine, quiet confidence by focusing strictly on hard, evidence-based matches between the candidate’s background and the role.</w:t>
+      </w:r>
+    </w:p>
+    <w:p>
+      <w:pPr>
+        <w:pStyle w:val="NoSpacing"/>
         <w:ind w:left="720"/>
         <w:rPr>
           <w:rFonts w:ascii="Courier New" w:hAnsi="Courier New" w:cs="Courier New"/>
         </w:rPr>
       </w:pPr>
+    </w:p>
+    <w:p>
+      <w:pPr>
+        <w:pStyle w:val="NoSpacing"/>
+        <w:ind w:left="720"/>
+        <w:rPr>
+          <w:rFonts w:ascii="Courier New" w:hAnsi="Courier New" w:cs="Courier New"/>
+        </w:rPr>
+      </w:pPr>
       <w:r>
         <w:rPr>
           <w:rFonts w:ascii="Courier New" w:hAnsi="Courier New" w:cs="Courier New"/>
@@ -1150,6 +1165,7 @@
     </w:p>
     <w:p>
       <w:pPr>
+        <w:pStyle w:val="NoSpacing"/>
         <w:ind w:left="720"/>
         <w:rPr>
           <w:rFonts w:ascii="Courier New" w:hAnsi="Courier New" w:cs="Courier New"/>
@@ -1173,25 +1189,35 @@
         <w:rPr>
           <w:rFonts w:ascii="Courier New" w:hAnsi="Courier New" w:cs="Courier New"/>
         </w:rPr>
-        <w:t xml:space="preserve"> the uploaded job description and career history. Adopt the precise technical, operational, and domain-specific vocabulary of the candidate's industry (e.g., Cybersecurity, Finance, Healthcare, Management). Do not use generic, one-size-fits-all coaching templates.</w:t>
-      </w:r>
-    </w:p>
-    <w:p>
-      <w:pPr>
+        <w:t xml:space="preserve"> the uploaded job description, career profile, and any interviewer or company intelligence. Adopt the precise technical, operational, and domain-specific vocabulary of cybersecurity (endpoint </w:t>
+      </w:r>
+      <w:proofErr w:type="spellStart"/>
+      <w:r>
+        <w:rPr>
+          <w:rFonts w:ascii="Courier New" w:hAnsi="Courier New" w:cs="Courier New"/>
+        </w:rPr>
+        <w:t>defense</w:t>
+      </w:r>
+      <w:proofErr w:type="spellEnd"/>
+      <w:r>
+        <w:rPr>
+          <w:rFonts w:ascii="Courier New" w:hAnsi="Courier New" w:cs="Courier New"/>
+        </w:rPr>
+        <w:t>, Zero Trust, IAM, GRC, automation, etc.). Do not use generic coaching templates.</w:t>
+      </w:r>
+    </w:p>
+    <w:p>
+      <w:pPr>
+        <w:pStyle w:val="NoSpacing"/>
         <w:ind w:left="720"/>
         <w:rPr>
           <w:rFonts w:ascii="Courier New" w:hAnsi="Courier New" w:cs="Courier New"/>
         </w:rPr>
       </w:pPr>
-      <w:r>
-        <w:rPr>
-          <w:rFonts w:ascii="Courier New" w:hAnsi="Courier New" w:cs="Courier New"/>
-        </w:rPr>
-        <w:t>2. NO AI FLUFF: Absolutely ban words like leverage, passionate, driven, synergy, tapestry, proactive, pioneer, meticulous, dynamic, or testament.</w:t>
-      </w:r>
-    </w:p>
-    <w:p>
-      <w:pPr>
+    </w:p>
+    <w:p>
+      <w:pPr>
+        <w:pStyle w:val="NoSpacing"/>
         <w:ind w:left="720"/>
         <w:rPr>
           <w:rFonts w:ascii="Courier New" w:hAnsi="Courier New" w:cs="Courier New"/>
@@ -1201,25 +1227,21 @@
         <w:rPr>
           <w:rFonts w:ascii="Courier New" w:hAnsi="Courier New" w:cs="Courier New"/>
         </w:rPr>
-        <w:t>3. LOW ENERGY, HIGH AUTHORITY: Speak in a calm, steady, matter-of-fact tone. Do not look for "high enthusiasm" or "selling yourself." Focus entirely on matching hard evidence from the resume/profile to the requirements of the role. Let the data do the heavy lifting and build confidence through facts.</w:t>
-      </w:r>
-    </w:p>
-    <w:p>
-      <w:pPr>
+        <w:t>2. NO AI FLUFF: Absolutely ban words like leverage, passionate, driven, synergy, tapestry, proactive, pioneer, meticulous, dynamic, testament, rockstar, or any similar hype language.</w:t>
+      </w:r>
+    </w:p>
+    <w:p>
+      <w:pPr>
+        <w:pStyle w:val="NoSpacing"/>
         <w:ind w:left="720"/>
         <w:rPr>
           <w:rFonts w:ascii="Courier New" w:hAnsi="Courier New" w:cs="Courier New"/>
         </w:rPr>
       </w:pPr>
-      <w:r>
-        <w:rPr>
-          <w:rFonts w:ascii="Courier New" w:hAnsi="Courier New" w:cs="Courier New"/>
-        </w:rPr>
-        <w:t>4. THE MATCH TEST: If a skill, tool, or core capability is a direct match, highlight it as an unshakeable anchor strength. If there's a gap, be completely honest about it, but provide a seamless, non-defensive "bridge" to handle it smoothly.</w:t>
-      </w:r>
-    </w:p>
-    <w:p>
-      <w:pPr>
+    </w:p>
+    <w:p>
+      <w:pPr>
+        <w:pStyle w:val="NoSpacing"/>
         <w:ind w:left="720"/>
         <w:rPr>
           <w:rFonts w:ascii="Courier New" w:hAnsi="Courier New" w:cs="Courier New"/>
@@ -1229,14 +1251,170 @@
         <w:rPr>
           <w:rFonts w:ascii="Courier New" w:hAnsi="Courier New" w:cs="Courier New"/>
         </w:rPr>
-        <w:t>5. THE MIRROR TEST: Ensure all insights, summaries, and generated audio sound like two experienced peers talking over a normal cup of coffee. Use casual grammar, contractions, and varied sentence lengths. No "corporate-speak."</w:t>
+        <w:t>3. LOW ENERGY, HIGH AUTHORITY: Speak in a calm, steady, matter-of-fact tone. Build confidence through facts and demonstrated impact, never through cheerleading or forced enthusiasm.</w:t>
+      </w:r>
+    </w:p>
+    <w:p>
+      <w:pPr>
+        <w:pStyle w:val="NoSpacing"/>
+        <w:ind w:left="720"/>
+        <w:rPr>
+          <w:rFonts w:ascii="Courier New" w:hAnsi="Courier New" w:cs="Courier New"/>
+        </w:rPr>
+      </w:pPr>
+    </w:p>
+    <w:p>
+      <w:pPr>
+        <w:pStyle w:val="NoSpacing"/>
+        <w:ind w:left="720"/>
+        <w:rPr>
+          <w:rFonts w:ascii="Courier New" w:hAnsi="Courier New" w:cs="Courier New"/>
+        </w:rPr>
+      </w:pPr>
+      <w:r>
+        <w:rPr>
+          <w:rFonts w:ascii="Courier New" w:hAnsi="Courier New" w:cs="Courier New"/>
+        </w:rPr>
+        <w:t>4. THE MATCH TEST: If a skill, tool, project, or metric is a direct or strong match, highlight it as an unshakeable anchor strength with specific examples from the candidate’s history. If there’s a gap, be completely honest about it, then provide a seamless, non-defensive bridge or mitigation strategy the candidate can use in conversation.</w:t>
+      </w:r>
+    </w:p>
+    <w:p>
+      <w:pPr>
+        <w:pStyle w:val="NoSpacing"/>
+        <w:ind w:left="720"/>
+        <w:rPr>
+          <w:rFonts w:ascii="Courier New" w:hAnsi="Courier New" w:cs="Courier New"/>
+        </w:rPr>
+      </w:pPr>
+    </w:p>
+    <w:p>
+      <w:pPr>
+        <w:pStyle w:val="NoSpacing"/>
+        <w:ind w:left="720"/>
+        <w:rPr>
+          <w:rFonts w:ascii="Courier New" w:hAnsi="Courier New" w:cs="Courier New"/>
+        </w:rPr>
+      </w:pPr>
+      <w:r>
+        <w:rPr>
+          <w:rFonts w:ascii="Courier New" w:hAnsi="Courier New" w:cs="Courier New"/>
+        </w:rPr>
+        <w:t>5. INTERVIEW-PREP FOCUS: Prioritize generating usable content such as:</w:t>
+      </w:r>
+    </w:p>
+    <w:p>
+      <w:pPr>
+        <w:pStyle w:val="NoSpacing"/>
+        <w:ind w:left="720"/>
+        <w:rPr>
+          <w:rFonts w:ascii="Courier New" w:hAnsi="Courier New" w:cs="Courier New"/>
+        </w:rPr>
+      </w:pPr>
+      <w:r>
+        <w:rPr>
+          <w:rFonts w:ascii="Courier New" w:hAnsi="Courier New" w:cs="Courier New"/>
+        </w:rPr>
+        <w:t xml:space="preserve">   - Likely technical and </w:t>
+      </w:r>
+      <w:r>
+        <w:rPr>
+          <w:rFonts w:ascii="Courier New" w:hAnsi="Courier New" w:cs="Courier New"/>
+        </w:rPr>
+        <w:t>behavioural</w:t>
+      </w:r>
+      <w:r>
+        <w:rPr>
+          <w:rFonts w:ascii="Courier New" w:hAnsi="Courier New" w:cs="Courier New"/>
+        </w:rPr>
+        <w:t xml:space="preserve"> questions with strong example responses</w:t>
+      </w:r>
+    </w:p>
+    <w:p>
+      <w:pPr>
+        <w:pStyle w:val="NoSpacing"/>
+        <w:ind w:left="720"/>
+        <w:rPr>
+          <w:rFonts w:ascii="Courier New" w:hAnsi="Courier New" w:cs="Courier New"/>
+        </w:rPr>
+      </w:pPr>
+      <w:r>
+        <w:rPr>
+          <w:rFonts w:ascii="Courier New" w:hAnsi="Courier New" w:cs="Courier New"/>
+        </w:rPr>
+        <w:t xml:space="preserve">   - Anchor stories tied to specific requirements</w:t>
+      </w:r>
+    </w:p>
+    <w:p>
+      <w:pPr>
+        <w:pStyle w:val="NoSpacing"/>
+        <w:ind w:left="720"/>
+        <w:rPr>
+          <w:rFonts w:ascii="Courier New" w:hAnsi="Courier New" w:cs="Courier New"/>
+        </w:rPr>
+      </w:pPr>
+      <w:r>
+        <w:rPr>
+          <w:rFonts w:ascii="Courier New" w:hAnsi="Courier New" w:cs="Courier New"/>
+        </w:rPr>
+        <w:t xml:space="preserve">   - Gap-bridging language</w:t>
+      </w:r>
+    </w:p>
+    <w:p>
+      <w:pPr>
+        <w:pStyle w:val="NoSpacing"/>
+        <w:ind w:left="720"/>
+        <w:rPr>
+          <w:rFonts w:ascii="Courier New" w:hAnsi="Courier New" w:cs="Courier New"/>
+        </w:rPr>
+      </w:pPr>
+      <w:r>
+        <w:rPr>
+          <w:rFonts w:ascii="Courier New" w:hAnsi="Courier New" w:cs="Courier New"/>
+        </w:rPr>
+        <w:t xml:space="preserve">   - Smart questions the candidate can ask the interviewers</w:t>
+      </w:r>
+    </w:p>
+    <w:p>
+      <w:pPr>
+        <w:pStyle w:val="NoSpacing"/>
+        <w:ind w:left="720"/>
+        <w:rPr>
+          <w:rFonts w:ascii="Courier New" w:hAnsi="Courier New" w:cs="Courier New"/>
+        </w:rPr>
+      </w:pPr>
+      <w:r>
+        <w:rPr>
+          <w:rFonts w:ascii="Courier New" w:hAnsi="Courier New" w:cs="Courier New"/>
+        </w:rPr>
+        <w:t xml:space="preserve">   - Recovery scripts for brain fog or tough moments</w:t>
+      </w:r>
+    </w:p>
+    <w:p>
+      <w:pPr>
+        <w:ind w:left="720"/>
+        <w:rPr>
+          <w:rFonts w:ascii="Courier New" w:hAnsi="Courier New" w:cs="Courier New"/>
+        </w:rPr>
+      </w:pPr>
+    </w:p>
+    <w:p>
+      <w:pPr>
+        <w:ind w:left="720"/>
+        <w:rPr>
+          <w:rFonts w:ascii="Courier New" w:hAnsi="Courier New" w:cs="Courier New"/>
+        </w:rPr>
+      </w:pPr>
+      <w:r>
+        <w:rPr>
+          <w:rFonts w:ascii="Courier New" w:hAnsi="Courier New" w:cs="Courier New"/>
+        </w:rPr>
+        <w:t>6. THE MIRROR TEST: Ensure all insights, summaries, audio briefings, and chat responses sound like two experienced peers talking over a normal cup of coffee. Use casual grammar, contractions, varied sentence lengths, and straightforward language. No corporate-speak.</w:t>
       </w:r>
     </w:p>
     <w:p>
       <w:pPr>
         <w:pStyle w:val="Heading1"/>
       </w:pPr>
-      <w:bookmarkStart w:id="5" w:name="_Toc233657359"/>
       <w:r>
         <w:t>Step 3: Low-Energy Execution &amp; The Finish Line</w:t>
       </w:r>
@@ -1269,7 +1447,11 @@
         <w:t>Audio Overview</w:t>
       </w:r>
       <w:r>
-        <w:t xml:space="preserve"> inside the Studio panel. Because your custom prompt strictly blocks corporate hype and mandates a casual peer-to-peer tone, the two AI hosts will sound like two industry veterans reviewing your background against the role over coffee. Throw your headphones on, take a walk, or listen while relaxing. You are absorbing the exact alignment of your skills without staring at a screen or memorizing stressful bullet points.</w:t>
+        <w:t xml:space="preserve"> inside the Studio panel. Because your custom prompt strictly blocks corporate hype and mandates a casual peer-to-peer tone, the two AI hosts will sound like two </w:t>
+      </w:r>
+      <w:r>
+        <w:lastRenderedPageBreak/>
+        <w:t>industry veterans reviewing your background against the role over coffee. Throw your headphones on, take a walk, or listen while relaxing. You are absorbing the exact alignment of your skills without staring at a screen or memorizing stressful bullet points.</w:t>
       </w:r>
     </w:p>
     <w:p>
@@ -1341,7 +1523,6 @@
           <w:b/>
           <w:bCs/>
         </w:rPr>
-        <w:lastRenderedPageBreak/>
         <w:t>Brain Fog Recovery Scripts:</w:t>
       </w:r>
       <w:r>
@@ -2788,6 +2969,7 @@
   <w:style w:type="character" w:default="1" w:styleId="DefaultParagraphFont">
     <w:name w:val="Default Paragraph Font"/>
     <w:uiPriority w:val="1"/>
+    <w:semiHidden/>
     <w:unhideWhenUsed/>
   </w:style>
   <w:style w:type="table" w:default="1" w:styleId="TableNormal">
@@ -3210,6 +3392,15 @@
     <w:pPr>
       <w:spacing w:after="100"/>
       <w:ind w:left="220"/>
+    </w:pPr>
+  </w:style>
+  <w:style w:type="paragraph" w:styleId="NoSpacing">
+    <w:name w:val="No Spacing"/>
+    <w:uiPriority w:val="1"/>
+    <w:qFormat/>
+    <w:rsid w:val="006910CC"/>
+    <w:pPr>
+      <w:spacing w:after="0" w:line="240" w:lineRule="auto"/>
     </w:pPr>
   </w:style>
 </w:styles>

</xml_diff>

<commit_message>
Update The Fatigue-Resistant NotebookLM Interview Prep Guide.docx
</commit_message>
<xml_diff>
--- a/The Fatigue-Resistant NotebookLM Interview Prep Guide.docx
+++ b/The Fatigue-Resistant NotebookLM Interview Prep Guide.docx
@@ -59,7 +59,7 @@
           <w:r>
             <w:fldChar w:fldCharType="separate"/>
           </w:r>
-          <w:hyperlink w:anchor="_Toc233657354" w:history="1">
+          <w:hyperlink w:anchor="_Toc233834699" w:history="1">
             <w:r>
               <w:rPr>
                 <w:rStyle w:val="Hyperlink"/>
@@ -86,7 +86,7 @@
                 <w:noProof/>
                 <w:webHidden/>
               </w:rPr>
-              <w:instrText xml:space="preserve"> PAGEREF _Toc233657354 \h </w:instrText>
+              <w:instrText xml:space="preserve"> PAGEREF _Toc233834699 \h </w:instrText>
             </w:r>
             <w:r>
               <w:rPr>
@@ -131,7 +131,7 @@
               <w:lang w:eastAsia="en-GB"/>
             </w:rPr>
           </w:pPr>
-          <w:hyperlink w:anchor="_Toc233657355" w:history="1">
+          <w:hyperlink w:anchor="_Toc233834700" w:history="1">
             <w:r>
               <w:rPr>
                 <w:rStyle w:val="Hyperlink"/>
@@ -158,7 +158,7 @@
                 <w:noProof/>
                 <w:webHidden/>
               </w:rPr>
-              <w:instrText xml:space="preserve"> PAGEREF _Toc233657355 \h </w:instrText>
+              <w:instrText xml:space="preserve"> PAGEREF _Toc233834700 \h </w:instrText>
             </w:r>
             <w:r>
               <w:rPr>
@@ -203,7 +203,7 @@
               <w:lang w:eastAsia="en-GB"/>
             </w:rPr>
           </w:pPr>
-          <w:hyperlink w:anchor="_Toc233657356" w:history="1">
+          <w:hyperlink w:anchor="_Toc233834701" w:history="1">
             <w:r>
               <w:rPr>
                 <w:rStyle w:val="Hyperlink"/>
@@ -230,7 +230,7 @@
                 <w:noProof/>
                 <w:webHidden/>
               </w:rPr>
-              <w:instrText xml:space="preserve"> PAGEREF _Toc233657356 \h </w:instrText>
+              <w:instrText xml:space="preserve"> PAGEREF _Toc233834701 \h </w:instrText>
             </w:r>
             <w:r>
               <w:rPr>
@@ -275,7 +275,7 @@
               <w:lang w:eastAsia="en-GB"/>
             </w:rPr>
           </w:pPr>
-          <w:hyperlink w:anchor="_Toc233657357" w:history="1">
+          <w:hyperlink w:anchor="_Toc233834702" w:history="1">
             <w:r>
               <w:rPr>
                 <w:rStyle w:val="Hyperlink"/>
@@ -302,7 +302,7 @@
                 <w:noProof/>
                 <w:webHidden/>
               </w:rPr>
-              <w:instrText xml:space="preserve"> PAGEREF _Toc233657357 \h </w:instrText>
+              <w:instrText xml:space="preserve"> PAGEREF _Toc233834702 \h </w:instrText>
             </w:r>
             <w:r>
               <w:rPr>
@@ -322,7 +322,7 @@
                 <w:noProof/>
                 <w:webHidden/>
               </w:rPr>
-              <w:t>1</w:t>
+              <w:t>2</w:t>
             </w:r>
             <w:r>
               <w:rPr>
@@ -347,7 +347,7 @@
               <w:lang w:eastAsia="en-GB"/>
             </w:rPr>
           </w:pPr>
-          <w:hyperlink w:anchor="_Toc233657358" w:history="1">
+          <w:hyperlink w:anchor="_Toc233834703" w:history="1">
             <w:r>
               <w:rPr>
                 <w:rStyle w:val="Hyperlink"/>
@@ -374,7 +374,7 @@
                 <w:noProof/>
                 <w:webHidden/>
               </w:rPr>
-              <w:instrText xml:space="preserve"> PAGEREF _Toc233657358 \h </w:instrText>
+              <w:instrText xml:space="preserve"> PAGEREF _Toc233834703 \h </w:instrText>
             </w:r>
             <w:r>
               <w:rPr>
@@ -419,7 +419,7 @@
               <w:lang w:eastAsia="en-GB"/>
             </w:rPr>
           </w:pPr>
-          <w:hyperlink w:anchor="_Toc233657359" w:history="1">
+          <w:hyperlink w:anchor="_Toc233834704" w:history="1">
             <w:r>
               <w:rPr>
                 <w:rStyle w:val="Hyperlink"/>
@@ -446,7 +446,7 @@
                 <w:noProof/>
                 <w:webHidden/>
               </w:rPr>
-              <w:instrText xml:space="preserve"> PAGEREF _Toc233657359 \h </w:instrText>
+              <w:instrText xml:space="preserve"> PAGEREF _Toc233834704 \h </w:instrText>
             </w:r>
             <w:r>
               <w:rPr>
@@ -466,7 +466,7 @@
                 <w:noProof/>
                 <w:webHidden/>
               </w:rPr>
-              <w:t>3</w:t>
+              <w:t>4</w:t>
             </w:r>
             <w:r>
               <w:rPr>
@@ -491,7 +491,7 @@
               <w:lang w:eastAsia="en-GB"/>
             </w:rPr>
           </w:pPr>
-          <w:hyperlink w:anchor="_Toc233657360" w:history="1">
+          <w:hyperlink w:anchor="_Toc233834705" w:history="1">
             <w:r>
               <w:rPr>
                 <w:rStyle w:val="Hyperlink"/>
@@ -518,7 +518,7 @@
                 <w:noProof/>
                 <w:webHidden/>
               </w:rPr>
-              <w:instrText xml:space="preserve"> PAGEREF _Toc233657360 \h </w:instrText>
+              <w:instrText xml:space="preserve"> PAGEREF _Toc233834705 \h </w:instrText>
             </w:r>
             <w:r>
               <w:rPr>
@@ -538,7 +538,7 @@
                 <w:noProof/>
                 <w:webHidden/>
               </w:rPr>
-              <w:t>3</w:t>
+              <w:t>4</w:t>
             </w:r>
             <w:r>
               <w:rPr>
@@ -563,7 +563,7 @@
               <w:lang w:eastAsia="en-GB"/>
             </w:rPr>
           </w:pPr>
-          <w:hyperlink w:anchor="_Toc233657361" w:history="1">
+          <w:hyperlink w:anchor="_Toc233834706" w:history="1">
             <w:r>
               <w:rPr>
                 <w:rStyle w:val="Hyperlink"/>
@@ -590,7 +590,7 @@
                 <w:noProof/>
                 <w:webHidden/>
               </w:rPr>
-              <w:instrText xml:space="preserve"> PAGEREF _Toc233657361 \h </w:instrText>
+              <w:instrText xml:space="preserve"> PAGEREF _Toc233834706 \h </w:instrText>
             </w:r>
             <w:r>
               <w:rPr>
@@ -610,7 +610,7 @@
                 <w:noProof/>
                 <w:webHidden/>
               </w:rPr>
-              <w:t>3</w:t>
+              <w:t>4</w:t>
             </w:r>
             <w:r>
               <w:rPr>
@@ -637,7 +637,7 @@
       <w:pPr>
         <w:pStyle w:val="Heading1"/>
       </w:pPr>
-      <w:bookmarkStart w:id="0" w:name="_Toc233657354"/>
+      <w:bookmarkStart w:id="0" w:name="_Toc233834699"/>
       <w:r>
         <w:t>Intro</w:t>
       </w:r>
@@ -660,7 +660,7 @@
       <w:pPr>
         <w:pStyle w:val="Heading1"/>
       </w:pPr>
-      <w:bookmarkStart w:id="1" w:name="_Toc233657355"/>
+      <w:bookmarkStart w:id="1" w:name="_Toc233834700"/>
       <w:r>
         <w:t>Step 1: The Zero-Effort Intake Folder</w:t>
       </w:r>
@@ -696,7 +696,7 @@
       <w:pPr>
         <w:pStyle w:val="Heading2"/>
       </w:pPr>
-      <w:bookmarkStart w:id="2" w:name="_Toc233657356"/>
+      <w:bookmarkStart w:id="2" w:name="_Toc233834701"/>
       <w:r>
         <w:t>01 - The Blueprint (Your Master Career Profile)</w:t>
       </w:r>
@@ -732,16 +732,44 @@
           <w:b/>
           <w:bCs/>
         </w:rPr>
-        <w:t>Format Requirement:</w:t>
-      </w:r>
-      <w:r>
-        <w:t xml:space="preserve"> If your profile is written in Markdown or structured JSON, </w:t>
+        <w:t xml:space="preserve">A resume will </w:t>
       </w:r>
       <w:r>
         <w:rPr>
           <w:b/>
           <w:bCs/>
         </w:rPr>
+        <w:t>work:</w:t>
+      </w:r>
+      <w:r>
+        <w:t xml:space="preserve"> The reason I suggest making a more detailed career profile is that </w:t>
+      </w:r>
+      <w:r>
+        <w:t>we tune every resume for the specific posting these days, often there is more to you then what we put in the resume.</w:t>
+      </w:r>
+    </w:p>
+    <w:p>
+      <w:pPr>
+        <w:numPr>
+          <w:ilvl w:val="0"/>
+          <w:numId w:val="4"/>
+        </w:numPr>
+      </w:pPr>
+      <w:r>
+        <w:rPr>
+          <w:b/>
+          <w:bCs/>
+        </w:rPr>
+        <w:t>Format Requirement:</w:t>
+      </w:r>
+      <w:r>
+        <w:t xml:space="preserve"> If your profile is written in Markdown or structured JSON, </w:t>
+      </w:r>
+      <w:r>
+        <w:rPr>
+          <w:b/>
+          <w:bCs/>
+        </w:rPr>
         <w:t>you must rename the file to have a .txt extension</w:t>
       </w:r>
       <w:r>
@@ -760,8 +788,9 @@
       <w:pPr>
         <w:pStyle w:val="Heading2"/>
       </w:pPr>
-      <w:bookmarkStart w:id="3" w:name="_Toc233657357"/>
-      <w:r>
+      <w:bookmarkStart w:id="3" w:name="_Toc233834702"/>
+      <w:r>
+        <w:lastRenderedPageBreak/>
         <w:t>02 - Job Intel &amp; OSINT (The Target)</w:t>
       </w:r>
       <w:bookmarkEnd w:id="3"/>
@@ -1054,7 +1083,7 @@
       <w:pPr>
         <w:pStyle w:val="Heading1"/>
       </w:pPr>
-      <w:bookmarkStart w:id="4" w:name="_Toc233657358"/>
+      <w:bookmarkStart w:id="4" w:name="_Toc233834703"/>
       <w:r>
         <w:t>Step 2: Injecting the Persona (The Fatigue Firewall)</w:t>
       </w:r>
@@ -1098,6 +1127,7 @@
     </w:p>
     <w:p>
       <w:r>
+        <w:lastRenderedPageBreak/>
         <w:t>Markdown</w:t>
       </w:r>
     </w:p>
@@ -1109,7 +1139,6 @@
           <w:rFonts w:ascii="Courier New" w:hAnsi="Courier New" w:cs="Courier New"/>
         </w:rPr>
       </w:pPr>
-      <w:bookmarkStart w:id="5" w:name="_Toc233657359"/>
       <w:r>
         <w:rPr>
           <w:rFonts w:ascii="Courier New" w:hAnsi="Courier New" w:cs="Courier New"/>
@@ -1129,14 +1158,7 @@
         <w:rPr>
           <w:rFonts w:ascii="Courier New" w:hAnsi="Courier New" w:cs="Courier New"/>
         </w:rPr>
-        <w:t xml:space="preserve">You are a grounded, direct Executive Interview Coach. Adopt "The Fatigue Firewall" protocol. Assume the candidate is a seasoned, highly experienced cybersecurity professional who is mentally exhausted from a long job search. Your dual goals are: (1) generate clear, practical interview preparation </w:t>
-      </w:r>
-      <w:r>
-        <w:rPr>
-          <w:rFonts w:ascii="Courier New" w:hAnsi="Courier New" w:cs="Courier New"/>
-        </w:rPr>
-        <w:lastRenderedPageBreak/>
-        <w:t>content, and (2) rebuild genuine, quiet confidence by focusing strictly on hard, evidence-based matches between the candidate’s background and the role.</w:t>
+        <w:t>You are a grounded, direct Executive Interview Coach. Adopt "The Fatigue Firewall" protocol. Assume the candidate is a seasoned, highly experienced cybersecurity professional who is mentally exhausted from a long job search. Your dual goals are: (1) generate clear, practical interview preparation content, and (2) rebuild genuine, quiet confidence by focusing strictly on hard, evidence-based matches between the candidate’s background and the role.</w:t>
       </w:r>
     </w:p>
     <w:p>
@@ -1415,7 +1437,9 @@
       <w:pPr>
         <w:pStyle w:val="Heading1"/>
       </w:pPr>
-      <w:r>
+      <w:bookmarkStart w:id="5" w:name="_Toc233834704"/>
+      <w:r>
+        <w:lastRenderedPageBreak/>
         <w:t>Step 3: Low-Energy Execution &amp; The Finish Line</w:t>
       </w:r>
       <w:bookmarkEnd w:id="5"/>
@@ -1429,7 +1453,7 @@
       <w:pPr>
         <w:pStyle w:val="Heading2"/>
       </w:pPr>
-      <w:bookmarkStart w:id="6" w:name="_Toc233657360"/>
+      <w:bookmarkStart w:id="6" w:name="_Toc233834705"/>
       <w:r>
         <w:t>1. The Passive Audio Briefing (The Commute)</w:t>
       </w:r>
@@ -1447,18 +1471,14 @@
         <w:t>Audio Overview</w:t>
       </w:r>
       <w:r>
-        <w:t xml:space="preserve"> inside the Studio panel. Because your custom prompt strictly blocks corporate hype and mandates a casual peer-to-peer tone, the two AI hosts will sound like two </w:t>
-      </w:r>
-      <w:r>
-        <w:lastRenderedPageBreak/>
-        <w:t>industry veterans reviewing your background against the role over coffee. Throw your headphones on, take a walk, or listen while relaxing. You are absorbing the exact alignment of your skills without staring at a screen or memorizing stressful bullet points.</w:t>
+        <w:t xml:space="preserve"> inside the Studio panel. Because your custom prompt strictly blocks corporate hype and mandates a casual peer-to-peer tone, the two AI hosts will sound like two industry veterans reviewing your background against the role over coffee. Throw your headphones on, take a walk, or listen while relaxing. You are absorbing the exact alignment of your skills without staring at a screen or memorizing stressful bullet points.</w:t>
       </w:r>
     </w:p>
     <w:p>
       <w:pPr>
         <w:pStyle w:val="Heading2"/>
       </w:pPr>
-      <w:bookmarkStart w:id="7" w:name="_Toc233657361"/>
+      <w:bookmarkStart w:id="7" w:name="_Toc233834706"/>
       <w:r>
         <w:t>2. The Live Desktop Lifeline (Zero-Brain-Fog Chat)</w:t>
       </w:r>

</xml_diff>